<commit_message>
Tighten the Medscheme MSA with non-solicitation and related protections.
Adds mutual staff non-poach (12 months, with a six-month CTC liquidated amount), client non-circumvention and commission survival on Introduced Clients, plus data protection, insurance, warranties, indemnities, independent-contractor status, publicity, change control, commission audit, anti-bribery, conflicts, key personnel and return of property.

Co-authored-by: Trilogy BPO <craigs@trilogybpo.com>
</commit_message>
<xml_diff>
--- a/presentations/medscheme/proposal/Trilogy_CX_Medscheme_MSA.docx
+++ b/presentations/medscheme/proposal/Trilogy_CX_Medscheme_MSA.docx
@@ -2079,6 +2079,39 @@
           <w:color w:val="13202E"/>
           <w:sz w:val="22"/>
         </w:rPr>
+        <w:t>Affiliate</w:t>
+      </w:r>
+      <w:r>
+        <w:rPr>
+          <w:rFonts w:ascii="Calibri" w:hAnsi="Calibri" w:eastAsia="Calibri"/>
+          <w:b w:val="0"/>
+          <w:color w:val="13202E"/>
+          <w:sz w:val="22"/>
+        </w:rPr>
+        <w:t>" means any person that Controls, is Controlled by, or is under common Control with a party, and "Control" has the meaning in the Companies Act, 71 of 2008.</w:t>
+      </w:r>
+    </w:p>
+    <w:p>
+      <w:pPr>
+        <w:spacing w:after="120" w:line="269" w:lineRule="auto"/>
+        <w:jc w:val="both"/>
+      </w:pPr>
+      <w:r>
+        <w:rPr>
+          <w:rFonts w:ascii="Calibri" w:hAnsi="Calibri" w:eastAsia="Calibri"/>
+          <w:b w:val="0"/>
+          <w:color w:val="13202E"/>
+          <w:sz w:val="22"/>
+        </w:rPr>
+        <w:t>A1.3  "</w:t>
+      </w:r>
+      <w:r>
+        <w:rPr>
+          <w:rFonts w:ascii="Calibri" w:hAnsi="Calibri" w:eastAsia="Calibri"/>
+          <w:b/>
+          <w:color w:val="13202E"/>
+          <w:sz w:val="22"/>
+        </w:rPr>
         <w:t>Charges</w:t>
       </w:r>
       <w:r>
@@ -2103,7 +2136,7 @@
           <w:color w:val="13202E"/>
           <w:sz w:val="22"/>
         </w:rPr>
-        <w:t>A1.3  "</w:t>
+        <w:t>A1.4  "</w:t>
       </w:r>
       <w:r>
         <w:rPr>
@@ -2121,7 +2154,7 @@
           <w:color w:val="13202E"/>
           <w:sz w:val="22"/>
         </w:rPr>
-        <w:t>" means all information of a party, in any form, that is by its nature confidential or is designated as such, including client lists, pricing, proposals, personal information, and the existence and terms of this Agreement, excluding information that is public other than by breach, or independently developed without use of the other party’s information.</w:t>
+        <w:t>" means all information of a party, in any form, that is by its nature confidential or is designated as such, including client lists, pricing, proposals, personal information, target lists, and the existence and terms of this Agreement, excluding information that is public other than by breach, or independently developed without use of the other party’s information.</w:t>
       </w:r>
     </w:p>
     <w:p>
@@ -2136,7 +2169,106 @@
           <w:color w:val="13202E"/>
           <w:sz w:val="22"/>
         </w:rPr>
-        <w:t>A1.4  "</w:t>
+        <w:t>A1.5  "</w:t>
+      </w:r>
+      <w:r>
+        <w:rPr>
+          <w:rFonts w:ascii="Calibri" w:hAnsi="Calibri" w:eastAsia="Calibri"/>
+          <w:b/>
+          <w:color w:val="13202E"/>
+          <w:sz w:val="22"/>
+        </w:rPr>
+        <w:t>Introduced Client</w:t>
+      </w:r>
+      <w:r>
+        <w:rPr>
+          <w:rFonts w:ascii="Calibri" w:hAnsi="Calibri" w:eastAsia="Calibri"/>
+          <w:b w:val="0"/>
+          <w:color w:val="13202E"/>
+          <w:sz w:val="22"/>
+        </w:rPr>
+        <w:t>" means any person (a) identified on a written target list prepared under Addendum 1, or (b) to whom the Client, the Supplier or Precision Point makes a sales approach, proposal or introduction in connection with Addendum 1, or (c) with whom the Client contracts for healthcare BPO / GBS or related services where that opportunity arose from the Services.</w:t>
+      </w:r>
+    </w:p>
+    <w:p>
+      <w:pPr>
+        <w:spacing w:after="120" w:line="269" w:lineRule="auto"/>
+        <w:jc w:val="both"/>
+      </w:pPr>
+      <w:r>
+        <w:rPr>
+          <w:rFonts w:ascii="Calibri" w:hAnsi="Calibri" w:eastAsia="Calibri"/>
+          <w:b w:val="0"/>
+          <w:color w:val="13202E"/>
+          <w:sz w:val="22"/>
+        </w:rPr>
+        <w:t>A1.6  "</w:t>
+      </w:r>
+      <w:r>
+        <w:rPr>
+          <w:rFonts w:ascii="Calibri" w:hAnsi="Calibri" w:eastAsia="Calibri"/>
+          <w:b/>
+          <w:color w:val="13202E"/>
+          <w:sz w:val="22"/>
+        </w:rPr>
+        <w:t>Personnel</w:t>
+      </w:r>
+      <w:r>
+        <w:rPr>
+          <w:rFonts w:ascii="Calibri" w:hAnsi="Calibri" w:eastAsia="Calibri"/>
+          <w:b w:val="0"/>
+          <w:color w:val="13202E"/>
+          <w:sz w:val="22"/>
+        </w:rPr>
+        <w:t>" means directors, officers, employees, contractors and seconded staff of a party or its Affiliates who perform or receive the Services or who have material contact with the other party in connection with this Agreement.</w:t>
+      </w:r>
+    </w:p>
+    <w:p>
+      <w:pPr>
+        <w:spacing w:after="120" w:line="269" w:lineRule="auto"/>
+        <w:jc w:val="both"/>
+      </w:pPr>
+      <w:r>
+        <w:rPr>
+          <w:rFonts w:ascii="Calibri" w:hAnsi="Calibri" w:eastAsia="Calibri"/>
+          <w:b w:val="0"/>
+          <w:color w:val="13202E"/>
+          <w:sz w:val="22"/>
+        </w:rPr>
+        <w:t>A1.7  "</w:t>
+      </w:r>
+      <w:r>
+        <w:rPr>
+          <w:rFonts w:ascii="Calibri" w:hAnsi="Calibri" w:eastAsia="Calibri"/>
+          <w:b/>
+          <w:color w:val="13202E"/>
+          <w:sz w:val="22"/>
+        </w:rPr>
+        <w:t>Personal Information</w:t>
+      </w:r>
+      <w:r>
+        <w:rPr>
+          <w:rFonts w:ascii="Calibri" w:hAnsi="Calibri" w:eastAsia="Calibri"/>
+          <w:b w:val="0"/>
+          <w:color w:val="13202E"/>
+          <w:sz w:val="22"/>
+        </w:rPr>
+        <w:t>" means has the meaning in the Protection of Personal Information Act, 4 of 2013 (POPIA), and includes personal data under the UK GDPR / EU GDPR where applicable.</w:t>
+      </w:r>
+    </w:p>
+    <w:p>
+      <w:pPr>
+        <w:spacing w:after="120" w:line="269" w:lineRule="auto"/>
+        <w:jc w:val="both"/>
+      </w:pPr>
+      <w:r>
+        <w:rPr>
+          <w:rFonts w:ascii="Calibri" w:hAnsi="Calibri" w:eastAsia="Calibri"/>
+          <w:b w:val="0"/>
+          <w:color w:val="13202E"/>
+          <w:sz w:val="22"/>
+        </w:rPr>
+        <w:t>A1.8  "</w:t>
       </w:r>
       <w:r>
         <w:rPr>
@@ -2169,7 +2301,40 @@
           <w:color w:val="13202E"/>
           <w:sz w:val="22"/>
         </w:rPr>
-        <w:t>A1.5  "</w:t>
+        <w:t>A1.9  "</w:t>
+      </w:r>
+      <w:r>
+        <w:rPr>
+          <w:rFonts w:ascii="Calibri" w:hAnsi="Calibri" w:eastAsia="Calibri"/>
+          <w:b/>
+          <w:color w:val="13202E"/>
+          <w:sz w:val="22"/>
+        </w:rPr>
+        <w:t>Restricted Period</w:t>
+      </w:r>
+      <w:r>
+        <w:rPr>
+          <w:rFonts w:ascii="Calibri" w:hAnsi="Calibri" w:eastAsia="Calibri"/>
+          <w:b w:val="0"/>
+          <w:color w:val="13202E"/>
+          <w:sz w:val="22"/>
+        </w:rPr>
+        <w:t>" means the Term and a period of 12 (twelve) months after the Term ends, for any reason.</w:t>
+      </w:r>
+    </w:p>
+    <w:p>
+      <w:pPr>
+        <w:spacing w:after="120" w:line="269" w:lineRule="auto"/>
+        <w:jc w:val="both"/>
+      </w:pPr>
+      <w:r>
+        <w:rPr>
+          <w:rFonts w:ascii="Calibri" w:hAnsi="Calibri" w:eastAsia="Calibri"/>
+          <w:b w:val="0"/>
+          <w:color w:val="13202E"/>
+          <w:sz w:val="22"/>
+        </w:rPr>
+        <w:t>A1.10  "</w:t>
       </w:r>
       <w:r>
         <w:rPr>
@@ -2202,7 +2367,7 @@
           <w:color w:val="13202E"/>
           <w:sz w:val="22"/>
         </w:rPr>
-        <w:t>A1.6  "</w:t>
+        <w:t>A1.11  "</w:t>
       </w:r>
       <w:r>
         <w:rPr>
@@ -2279,7 +2444,7 @@
           <w:color w:val="13202E"/>
           <w:sz w:val="22"/>
         </w:rPr>
-        <w:t>A2.3  The expiration or termination of this Agreement shall not affect those provisions which expressly or by necessity survive, including confidentiality, liability, IP, accrued Charges, commission on revenues billed in respect of introductions made during the Term, and dispute resolution.</w:t>
+        <w:t>A2.3  The expiration or termination of this Agreement shall not affect those provisions which expressly or by necessity survive, including confidentiality, non-solicitation, non-circumvention, data protection, liability, IP, accrued Charges, commission on revenues billed in respect of introductions made during the Term, audit, and dispute resolution.</w:t>
       </w:r>
     </w:p>
     <w:p>
@@ -2545,7 +2710,37 @@
           <w:color w:val="13202E"/>
           <w:sz w:val="22"/>
         </w:rPr>
-        <w:t>Both parties will keep all Confidential Information received from the other party confidential and secure. The receiving party must return or destroy such information upon termination or upon request, save for information it is required to retain for legal reasons. A receiving party may disclose such information strictly to its employees, representatives, professional advisors and direct suppliers (including Precision Point, in the case of the Supplier) who are required to know it for this Agreement, provided that such person is subject to confidentiality undertakings, or if required to be disclosed by law. If required to be disclosed by law, the receiving party shall notify the disclosing party as soon as possible prior to disclosure, if it is legally possible and/or able.</w:t>
+        <w:t>A6.1  Both parties will keep all Confidential Information received from the other party confidential and secure, and will use it only for this Agreement. The receiving party must return or destroy such information upon termination or upon request, save for information it is required to retain for legal reasons or in routine IT backups (which remain subject to this clause until deleted in the ordinary cycle).</w:t>
+      </w:r>
+    </w:p>
+    <w:p>
+      <w:pPr>
+        <w:spacing w:after="160" w:before="0" w:line="269" w:lineRule="auto"/>
+        <w:jc w:val="both"/>
+      </w:pPr>
+      <w:r>
+        <w:rPr>
+          <w:rFonts w:ascii="Calibri" w:hAnsi="Calibri" w:eastAsia="Calibri"/>
+          <w:b w:val="0"/>
+          <w:color w:val="13202E"/>
+          <w:sz w:val="22"/>
+        </w:rPr>
+        <w:t>A6.2  A receiving party may disclose Confidential Information strictly to its employees, representatives, professional advisors and direct suppliers (including Precision Point, in the case of the Supplier) who are required to know it for this Agreement, provided that such person is subject to confidentiality undertakings no less strict than this clause, or if required to be disclosed by law. If required to be disclosed by law, the receiving party shall notify the disclosing party as soon as possible prior to disclosure, if it is legally possible and/or able.</w:t>
+      </w:r>
+    </w:p>
+    <w:p>
+      <w:pPr>
+        <w:spacing w:after="160" w:before="0" w:line="269" w:lineRule="auto"/>
+        <w:jc w:val="both"/>
+      </w:pPr>
+      <w:r>
+        <w:rPr>
+          <w:rFonts w:ascii="Calibri" w:hAnsi="Calibri" w:eastAsia="Calibri"/>
+          <w:b w:val="0"/>
+          <w:color w:val="13202E"/>
+          <w:sz w:val="22"/>
+        </w:rPr>
+        <w:t>A6.3  The obligations in this clause A6 survive the Term for five (5) years, and indefinitely in respect of trade secrets and Personal Information.</w:t>
       </w:r>
     </w:p>
     <w:p>
@@ -2559,7 +2754,7 @@
           <w:color w:val="0E7C46"/>
           <w:sz w:val="26"/>
         </w:rPr>
-        <w:t>A7.  Liability</w:t>
+        <w:t>A7.  Non-solicitation of personnel</w:t>
       </w:r>
     </w:p>
     <w:p>
@@ -2574,7 +2769,7 @@
           <w:color w:val="13202E"/>
           <w:sz w:val="22"/>
         </w:rPr>
-        <w:t>A7.1  The Supplier shall only be liable for its own actions or omissions and shall not be liable for: any act or omissions of any third party (other than its subcontractors in respect of the Services); unavailability of systems due to disruption of or any failure or fault in apparatus, lines and systems (including a failure in any third party’s network); suspension of Services for routine or emergency maintenance or for non-payment; any event or circumstance which is out of the reasonable control of the Supplier (a force majeure event); any failure of non-Supplier equipment; any breach of security which occurs notwithstanding the Supplier’s compliance with its security undertakings.</w:t>
+        <w:t>A7.1  During the Restricted Period, neither party shall, directly or indirectly, solicit, entice, employ or engage (or attempt to do so) any Personnel of the other party (or of Precision Point, in the case of the Client) who was involved in the Services or with whom that party had material contact in connection with this Agreement, without the other party's prior written consent.</w:t>
       </w:r>
     </w:p>
     <w:p>
@@ -2589,7 +2784,7 @@
           <w:color w:val="13202E"/>
           <w:sz w:val="22"/>
         </w:rPr>
-        <w:t>A7.2  The Supplier’s liability, howsoever arising, is limited to the value of the professional fees that the Client has paid under the Addendum which is the subject of a claim in the immediate prior 12 months. Neither party is liable for indirect, incidental, or consequential damages, including loss of profit, revenue, goodwill or anticipated savings.</w:t>
+        <w:t>A7.2  This clause does not prevent a party from hiring a person who responds to a bona fide public advertisement not targeted at that person, or whose employment with the other party has ended more than three months before the approach, without prior solicitation in breach of A7.1.</w:t>
       </w:r>
     </w:p>
     <w:p>
@@ -2604,7 +2799,22 @@
           <w:color w:val="13202E"/>
           <w:sz w:val="22"/>
         </w:rPr>
-        <w:t>A7.3  Nothing in this Agreement excludes liability for fraud, death or personal injury caused by negligence, or any liability that cannot be excluded by South African law.</w:t>
+        <w:t>A7.3  If a party breaches clause A7.1, it shall pay the other party, as a genuine pre-estimate of recruitment, training and disruption loss (and not as a penalty), an amount equal to six (6) months' cost-to-company of the person concerned, within 30 days of written demand. This is in addition to any other remedy, including interdict.</w:t>
+      </w:r>
+    </w:p>
+    <w:p>
+      <w:pPr>
+        <w:spacing w:after="160" w:before="0" w:line="269" w:lineRule="auto"/>
+        <w:jc w:val="both"/>
+      </w:pPr>
+      <w:r>
+        <w:rPr>
+          <w:rFonts w:ascii="Calibri" w:hAnsi="Calibri" w:eastAsia="Calibri"/>
+          <w:b w:val="0"/>
+          <w:color w:val="13202E"/>
+          <w:sz w:val="22"/>
+        </w:rPr>
+        <w:t>A7.4  The parties record that this restraint is reasonable as to time, persons and activity, given access to Confidential Information, client relationships and trained staff. If a court finds any part too wide, that part shall be reduced to the maximum enforceable extent.</w:t>
       </w:r>
     </w:p>
     <w:p>
@@ -2618,7 +2828,7 @@
           <w:color w:val="0E7C46"/>
           <w:sz w:val="26"/>
         </w:rPr>
-        <w:t>A8.  Intellectual property</w:t>
+        <w:t>A8.  Non-solicitation of clients and non-circumvention</w:t>
       </w:r>
     </w:p>
     <w:p>
@@ -2633,7 +2843,52 @@
           <w:color w:val="13202E"/>
           <w:sz w:val="22"/>
         </w:rPr>
-        <w:t>Each party retains ownership of its intellectual property, with no transfer of rights unless expressly agreed in writing. The Client is granted a non-exclusive licence to use deliverables produced under an Addendum for its internal business purposes. The Supplier may reuse generic know-how, methodologies and templates. Marketing and sales collateral produced for the Client may be used by both parties for the purpose of the engagement.</w:t>
+        <w:t>A8.1  During the Restricted Period, the Client shall not circumvent the Supplier by contracting with Precision Point (or any other consultant introduced by the Supplier) for sales, marketing, market-pricing or introductions of the kind in Addendum 1, except through the Supplier or with the Supplier's prior written consent.</w:t>
+      </w:r>
+    </w:p>
+    <w:p>
+      <w:pPr>
+        <w:spacing w:after="160" w:before="0" w:line="269" w:lineRule="auto"/>
+        <w:jc w:val="both"/>
+      </w:pPr>
+      <w:r>
+        <w:rPr>
+          <w:rFonts w:ascii="Calibri" w:hAnsi="Calibri" w:eastAsia="Calibri"/>
+          <w:b w:val="0"/>
+          <w:color w:val="13202E"/>
+          <w:sz w:val="22"/>
+        </w:rPr>
+        <w:t>A8.2  During the Restricted Period, the Supplier shall not, for its own account or for a competing healthcare BPO / GBS provider, solicit or accept an engagement from an Introduced Client to provide the same class of healthcare administration / BPO services that the Client was proposing to that Introduced Client, except with the Client's prior written consent. This does not prevent the Supplier from providing CX, GCC, digital or other services that are not a substitute for the Client's healthcare BPO offering.</w:t>
+      </w:r>
+    </w:p>
+    <w:p>
+      <w:pPr>
+        <w:spacing w:after="160" w:before="0" w:line="269" w:lineRule="auto"/>
+        <w:jc w:val="both"/>
+      </w:pPr>
+      <w:r>
+        <w:rPr>
+          <w:rFonts w:ascii="Calibri" w:hAnsi="Calibri" w:eastAsia="Calibri"/>
+          <w:b w:val="0"/>
+          <w:color w:val="13202E"/>
+          <w:sz w:val="22"/>
+        </w:rPr>
+        <w:t>A8.3  Closing a deal with an Introduced Client without the Supplier does not avoid commission. If, during the Restricted Period, the Client (or an Affiliate) bills revenue to an Introduced Client for healthcare BPO / GBS or related services, the commission in Addendum 1 remains payable whether or not the Supplier is still engaged on that account.</w:t>
+      </w:r>
+    </w:p>
+    <w:p>
+      <w:pPr>
+        <w:spacing w:after="160" w:before="0" w:line="269" w:lineRule="auto"/>
+        <w:jc w:val="both"/>
+      </w:pPr>
+      <w:r>
+        <w:rPr>
+          <w:rFonts w:ascii="Calibri" w:hAnsi="Calibri" w:eastAsia="Calibri"/>
+          <w:b w:val="0"/>
+          <w:color w:val="13202E"/>
+          <w:sz w:val="22"/>
+        </w:rPr>
+        <w:t>A8.4  Nothing in this clause A8 makes the Supplier the Client's exclusive route to all UK/US healthcare demand, except that opportunities on the written target list (and other Introduced Clients) are covered as set out above. The Supplier may serve other clients in other sectors and geographies.</w:t>
       </w:r>
     </w:p>
     <w:p>
@@ -2647,7 +2902,7 @@
           <w:color w:val="0E7C46"/>
           <w:sz w:val="26"/>
         </w:rPr>
-        <w:t>A9.  Force majeure</w:t>
+        <w:t>A9.  Data protection</w:t>
       </w:r>
     </w:p>
     <w:p>
@@ -2662,7 +2917,37 @@
           <w:color w:val="13202E"/>
           <w:sz w:val="22"/>
         </w:rPr>
-        <w:t>The Supplier is not liable for delays or non-performance due to events beyond its control, such as natural disasters, epidemic, utility failure, or strikes. If such events last over three months, the Client may terminate the affected Addendum on 10 business days’ written demand.</w:t>
+        <w:t>A9.1  Each party shall comply with POPIA and, where it processes Personal Information of persons in the UK or EEA in connection with the Services, with the UK GDPR / EU GDPR as applicable. Gate 1 and sales enablement are not intended to include processing of medical-scheme member records or special personal information. If that processing becomes necessary, the parties will sign a written operator / processor addendum before it starts.</w:t>
+      </w:r>
+    </w:p>
+    <w:p>
+      <w:pPr>
+        <w:spacing w:after="160" w:before="0" w:line="269" w:lineRule="auto"/>
+        <w:jc w:val="both"/>
+      </w:pPr>
+      <w:r>
+        <w:rPr>
+          <w:rFonts w:ascii="Calibri" w:hAnsi="Calibri" w:eastAsia="Calibri"/>
+          <w:b w:val="0"/>
+          <w:color w:val="13202E"/>
+          <w:sz w:val="22"/>
+        </w:rPr>
+        <w:t>A9.2  Each party is responsible for Personal Information of its own staff. The Client warrants that it has a lawful basis to share with the Supplier any business-contact data of prospects and Introduced Clients. The Supplier shall not sell that data and shall use it only for the Services.</w:t>
+      </w:r>
+    </w:p>
+    <w:p>
+      <w:pPr>
+        <w:spacing w:after="160" w:before="0" w:line="269" w:lineRule="auto"/>
+        <w:jc w:val="both"/>
+      </w:pPr>
+      <w:r>
+        <w:rPr>
+          <w:rFonts w:ascii="Calibri" w:hAnsi="Calibri" w:eastAsia="Calibri"/>
+          <w:b w:val="0"/>
+          <w:color w:val="13202E"/>
+          <w:sz w:val="22"/>
+        </w:rPr>
+        <w:t>A9.3  A party shall notify the other without undue delay, and in any event within 48 hours of becoming aware, of a security compromise affecting Personal Information received from the other party, and shall reasonably cooperate on any regulator or data-subject response.</w:t>
       </w:r>
     </w:p>
     <w:p>
@@ -2676,7 +2961,7 @@
           <w:color w:val="0E7C46"/>
           <w:sz w:val="26"/>
         </w:rPr>
-        <w:t>A10.  Dispute resolution</w:t>
+        <w:t>A10.  Insurance</w:t>
       </w:r>
     </w:p>
     <w:p>
@@ -2691,7 +2976,7 @@
           <w:color w:val="13202E"/>
           <w:sz w:val="22"/>
         </w:rPr>
-        <w:t>A10.1  In the event of a dispute arising from or in connection with this Agreement, the parties shall first attempt to resolve the matter through good faith negotiations.</w:t>
+        <w:t>A10.1  For the Term and 12 months thereafter, the Supplier shall maintain, with a reputable insurer, public liability and professional indemnity insurance appropriate to the Services, each with a limit of not less than R10,000,000 per claim (or equivalent). The Supplier shall provide evidence of cover on reasonable written request.</w:t>
       </w:r>
     </w:p>
     <w:p>
@@ -2706,7 +2991,7 @@
           <w:color w:val="13202E"/>
           <w:sz w:val="22"/>
         </w:rPr>
-        <w:t>A10.2  If unresolved within 10 business days, the dispute shall be referred to mediation, and if necessary, arbitration in Johannesburg in accordance with the rules of the Arbitration Foundation of Southern Africa (AFSA). This clause shall not preclude either party from seeking urgent interim relief, and the Supplier shall be entitled to approach any court of competent jurisdiction for any unpaid Charges.</w:t>
+        <w:t>A10.2  Insurance does not limit the Supplier's liability except as set out in clause A21.</w:t>
       </w:r>
     </w:p>
     <w:p>
@@ -2720,12 +3005,12 @@
           <w:color w:val="0E7C46"/>
           <w:sz w:val="26"/>
         </w:rPr>
-        <w:t>A11.  General</w:t>
+        <w:t>A11.  Warranties</w:t>
       </w:r>
     </w:p>
     <w:p>
       <w:pPr>
-        <w:spacing w:after="120" w:before="0" w:line="269" w:lineRule="auto"/>
+        <w:spacing w:after="160" w:before="0" w:line="269" w:lineRule="auto"/>
         <w:jc w:val="both"/>
       </w:pPr>
       <w:r>
@@ -2735,12 +3020,12 @@
           <w:color w:val="13202E"/>
           <w:sz w:val="22"/>
         </w:rPr>
-        <w:t>A11.1  This Agreement will be governed under the laws of South Africa, and both parties submit to the exclusive jurisdiction of the South African courts (subject to clause A10).</w:t>
+        <w:t>A11.1  Each party warrants that it is duly incorporated, has power and authority to enter into this Agreement, and that the person signing is authorised.</w:t>
       </w:r>
     </w:p>
     <w:p>
       <w:pPr>
-        <w:spacing w:after="120" w:before="0" w:line="269" w:lineRule="auto"/>
+        <w:spacing w:after="160" w:before="0" w:line="269" w:lineRule="auto"/>
         <w:jc w:val="both"/>
       </w:pPr>
       <w:r>
@@ -2750,12 +3035,12 @@
           <w:color w:val="13202E"/>
           <w:sz w:val="22"/>
         </w:rPr>
-        <w:t>A11.2  This Agreement is the whole agreement between the Client and the Supplier and excludes any express or implied or tacit term, representation, warranty, promise or the like not recorded herein, whether it induced the contract or not, save for any statutory requirements. Any variation to this Agreement must be in writing and signed between the parties.</w:t>
+        <w:t>A11.2  The Supplier warrants that it will perform the Services with reasonable skill and care, using Personnel who are reasonably qualified for the tasks assigned to them, and that it will not knowingly infringe third-party intellectual property in materials it creates.</w:t>
       </w:r>
     </w:p>
     <w:p>
       <w:pPr>
-        <w:spacing w:after="120" w:before="0" w:line="269" w:lineRule="auto"/>
+        <w:spacing w:after="160" w:before="0" w:line="269" w:lineRule="auto"/>
         <w:jc w:val="both"/>
       </w:pPr>
       <w:r>
@@ -2765,12 +3050,12 @@
           <w:color w:val="13202E"/>
           <w:sz w:val="22"/>
         </w:rPr>
-        <w:t>A11.3  A failure or delay by a party to exercise any right or remedy hereunder or by law shall not constitute a waiver of that or any other right or remedy.</w:t>
+        <w:t>A11.3  The Client warrants that information it supplies is, to its knowledge, accurate and not misleading in any material respect, and that use of its brands, logos and scheme materials in collateral approved by it will not infringe third-party rights.</w:t>
       </w:r>
     </w:p>
     <w:p>
       <w:pPr>
-        <w:spacing w:after="120" w:before="0" w:line="269" w:lineRule="auto"/>
+        <w:spacing w:after="160" w:before="0" w:line="269" w:lineRule="auto"/>
         <w:jc w:val="both"/>
       </w:pPr>
       <w:r>
@@ -2780,12 +3065,26 @@
           <w:color w:val="13202E"/>
           <w:sz w:val="22"/>
         </w:rPr>
-        <w:t>A11.4  All notices must be delivered by hand or email to the address on the cover pages, or any other address notified to the other party, which takes effect on the 5th day of written notification. Any notice given in writing and actually received by a party’s authorised representatives will be deemed properly given, notwithstanding that it has not been given in accordance with this clause.</w:t>
+        <w:t>A11.4  Except as set out in this Agreement, all other warranties, whether express or implied by law, are excluded to the maximum extent permitted.</w:t>
       </w:r>
     </w:p>
     <w:p>
       <w:pPr>
-        <w:spacing w:after="120" w:before="0" w:line="269" w:lineRule="auto"/>
+        <w:spacing w:before="240" w:after="160"/>
+      </w:pPr>
+      <w:r>
+        <w:rPr>
+          <w:rFonts w:ascii="Calibri" w:hAnsi="Calibri" w:eastAsia="Calibri"/>
+          <w:b/>
+          <w:color w:val="0E7C46"/>
+          <w:sz w:val="26"/>
+        </w:rPr>
+        <w:t>A12.  Indemnity</w:t>
+      </w:r>
+    </w:p>
+    <w:p>
+      <w:pPr>
+        <w:spacing w:after="160" w:before="0" w:line="269" w:lineRule="auto"/>
         <w:jc w:val="both"/>
       </w:pPr>
       <w:r>
@@ -2795,12 +3094,12 @@
           <w:color w:val="13202E"/>
           <w:sz w:val="22"/>
         </w:rPr>
-        <w:t>A11.5  When any number of days is prescribed, same shall be reckoned exclusively of the first and inclusively of the last day unless the last day falls on a Saturday, Sunday or South African public holiday, in which case the last day shall be the next succeeding business day.</w:t>
+        <w:t>A12.1  The Client indemnifies the Supplier against claims, damages and reasonable legal costs arising from (a) the Client's materials, brands or instructions, (b) the Client's use of deliverables other than as licensed, and (c) any Introduced Client or regulator claim to the extent caused by the Client's operations, pricing, or healthcare administration -- except to the extent caused by the Supplier's negligence or wilful default.</w:t>
       </w:r>
     </w:p>
     <w:p>
       <w:pPr>
-        <w:spacing w:after="120" w:before="0" w:line="269" w:lineRule="auto"/>
+        <w:spacing w:after="160" w:before="0" w:line="269" w:lineRule="auto"/>
         <w:jc w:val="both"/>
       </w:pPr>
       <w:r>
@@ -2810,12 +3109,26 @@
           <w:color w:val="13202E"/>
           <w:sz w:val="22"/>
         </w:rPr>
-        <w:t>A11.6  It is specifically recorded that whilst the parties may correspond via e-mail for operational reasons, no formal legal notice nor any amendment to the Agreement will be of any force and effect if communicated via e-mail, unless specifically for purposes of attaching a signed notice, save that (i) invoices and purchase-order references may be sent by e-mail, and (ii) prior agreement to pass-through costs may be given by e-mail.</w:t>
+        <w:t>A12.2  The Supplier indemnifies the Client against third-party claims that materials originally created by the Supplier for an Addendum infringe that third party's intellectual property, provided the Client gives prompt notice, does not admit liability, and allows the Supplier to conduct the defence. This indemnity does not apply to Client materials, third-party platforms, or combinations not approved by the Supplier.</w:t>
       </w:r>
     </w:p>
     <w:p>
       <w:pPr>
-        <w:spacing w:after="120" w:before="0" w:line="269" w:lineRule="auto"/>
+        <w:spacing w:before="240" w:after="160"/>
+      </w:pPr>
+      <w:r>
+        <w:rPr>
+          <w:rFonts w:ascii="Calibri" w:hAnsi="Calibri" w:eastAsia="Calibri"/>
+          <w:b/>
+          <w:color w:val="0E7C46"/>
+          <w:sz w:val="26"/>
+        </w:rPr>
+        <w:t>A13.  Relationship of the parties</w:t>
+      </w:r>
+    </w:p>
+    <w:p>
+      <w:pPr>
+        <w:spacing w:after="160" w:before="0" w:line="269" w:lineRule="auto"/>
         <w:jc w:val="both"/>
       </w:pPr>
       <w:r>
@@ -2825,12 +3138,12 @@
           <w:color w:val="13202E"/>
           <w:sz w:val="22"/>
         </w:rPr>
-        <w:t>A11.7  The provisions of the Agreement are severable and the invalidity of any one or more of such provisions will in no way affect the validity of the remaining provisions.</w:t>
+        <w:t>A13.1  The Supplier is an independent contractor. Nothing in this Agreement creates a partnership, joint venture, employment, or agency. Neither party may bind the other or hold itself out as doing so, except that the Supplier and Precision Point may represent that they are mandated to market the Client's international healthcare BPO capability, within approved collateral and messages.</w:t>
       </w:r>
     </w:p>
     <w:p>
       <w:pPr>
-        <w:spacing w:after="120" w:before="0" w:line="269" w:lineRule="auto"/>
+        <w:spacing w:after="160" w:before="0" w:line="269" w:lineRule="auto"/>
         <w:jc w:val="both"/>
       </w:pPr>
       <w:r>
@@ -2840,12 +3153,26 @@
           <w:color w:val="13202E"/>
           <w:sz w:val="22"/>
         </w:rPr>
-        <w:t>A11.8  Neither party may assign or transfer (in whole or in part) any of its rights or obligations under the Agreement, without the other party’s prior written consent (such consent not to be unreasonably withheld or delayed), except that the Supplier may assign to an affiliate in the Trilogy group on written notice.</w:t>
+        <w:t>A13.2  The Supplier's Personnel remain its employees or contractors. This Agreement does not transfer any employee to the Client (or the reverse). If any law treats a person as employed by the other party, the first party shall indemnify the other against resulting employment claims, except where that result was caused by the other party's own conduct.</w:t>
       </w:r>
     </w:p>
     <w:p>
       <w:pPr>
-        <w:spacing w:after="120" w:before="0" w:line="269" w:lineRule="auto"/>
+        <w:spacing w:before="240" w:after="160"/>
+      </w:pPr>
+      <w:r>
+        <w:rPr>
+          <w:rFonts w:ascii="Calibri" w:hAnsi="Calibri" w:eastAsia="Calibri"/>
+          <w:b/>
+          <w:color w:val="0E7C46"/>
+          <w:sz w:val="26"/>
+        </w:rPr>
+        <w:t>A14.  Publicity</w:t>
+      </w:r>
+    </w:p>
+    <w:p>
+      <w:pPr>
+        <w:spacing w:after="160" w:before="0" w:line="269" w:lineRule="auto"/>
         <w:jc w:val="both"/>
       </w:pPr>
       <w:r>
@@ -2855,12 +3182,26 @@
           <w:color w:val="13202E"/>
           <w:sz w:val="22"/>
         </w:rPr>
-        <w:t>A11.9  The Agreement may be executed in any number of counterparts, including electronic signature contemplated in the Electronic Communications and Transactions Act, 25 of 2002. No counterpart shall be effective until each party has executed at least one counterpart.</w:t>
+        <w:t>Neither party shall issue a press release or public announcement about this Agreement or name the other in marketing without prior written consent, except that (a) the Supplier may describe the engagement in confidential pitches as a healthcare GBS / BPO mandate, without disclosing commercial terms, and (b) both parties may use approved logos and case language once the Client has signed off collateral under Addendum 1. Consent shall not be unreasonably withheld for a factual announcement of the partnership.</w:t>
       </w:r>
     </w:p>
     <w:p>
       <w:pPr>
-        <w:spacing w:after="120" w:before="0" w:line="269" w:lineRule="auto"/>
+        <w:spacing w:before="240" w:after="160"/>
+      </w:pPr>
+      <w:r>
+        <w:rPr>
+          <w:rFonts w:ascii="Calibri" w:hAnsi="Calibri" w:eastAsia="Calibri"/>
+          <w:b/>
+          <w:color w:val="0E7C46"/>
+          <w:sz w:val="26"/>
+        </w:rPr>
+        <w:t>A15.  Change control</w:t>
+      </w:r>
+    </w:p>
+    <w:p>
+      <w:pPr>
+        <w:spacing w:after="160" w:before="0" w:line="269" w:lineRule="auto"/>
         <w:jc w:val="both"/>
       </w:pPr>
       <w:r>
@@ -2870,12 +3211,26 @@
           <w:color w:val="13202E"/>
           <w:sz w:val="22"/>
         </w:rPr>
-        <w:t>A11.10  The provisions of this Agreement shall be binding upon the successors-in-title and assigns of the parties.</w:t>
+        <w:t>A change to scope, deliverables, timetable or Charges is only binding if recorded in a written change note signed by both parties (e-mail with a signed attachment is sufficient). The Supplier is not obliged to perform out-of-scope work. Work done at the Client's written request outside an Addendum may be charged at the Supplier's then-current rates.</w:t>
       </w:r>
     </w:p>
     <w:p>
       <w:pPr>
-        <w:spacing w:after="120" w:before="0" w:line="269" w:lineRule="auto"/>
+        <w:spacing w:before="240" w:after="160"/>
+      </w:pPr>
+      <w:r>
+        <w:rPr>
+          <w:rFonts w:ascii="Calibri" w:hAnsi="Calibri" w:eastAsia="Calibri"/>
+          <w:b/>
+          <w:color w:val="0E7C46"/>
+          <w:sz w:val="26"/>
+        </w:rPr>
+        <w:t>A16.  Records and audit</w:t>
+      </w:r>
+    </w:p>
+    <w:p>
+      <w:pPr>
+        <w:spacing w:after="160" w:before="0" w:line="269" w:lineRule="auto"/>
         <w:jc w:val="both"/>
       </w:pPr>
       <w:r>
@@ -2885,12 +3240,12 @@
           <w:color w:val="13202E"/>
           <w:sz w:val="22"/>
         </w:rPr>
-        <w:t>A11.11  The rule of interpretation that a contract is to be interpreted against the party responsible for drafting shall not apply.</w:t>
+        <w:t>A16.1  The Client shall keep reasonable records of revenues billed to Introduced Clients, sufficient to calculate commission, for the Restricted Period. On not more than one occasion per calendar year (unless a discrepancy of more than 5% was found on the previous review), the Supplier may, on 10 business days' notice, inspect those records during normal hours, itself or through a professional advisor bound by confidentiality. The Client shall cooperate in good faith.</w:t>
       </w:r>
     </w:p>
     <w:p>
       <w:pPr>
-        <w:spacing w:after="120" w:before="0" w:line="269" w:lineRule="auto"/>
+        <w:spacing w:after="160" w:before="0" w:line="269" w:lineRule="auto"/>
         <w:jc w:val="both"/>
       </w:pPr>
       <w:r>
@@ -2900,7 +3255,493 @@
           <w:color w:val="13202E"/>
           <w:sz w:val="22"/>
         </w:rPr>
-        <w:t>A11.12  "Calendar month" means a month beginning on the first day of any given month and ending on the last day of the same month. Where notice is given on any day of the month other than the first, the notice period will only commence on the first day of the following month.</w:t>
+        <w:t>A16.2  If an inspection shows underpayment of more than 5% of commission due for the period reviewed, the Client shall pay the shortfall within 14 days and the reasonable cost of the inspection. Overpayment shall be credited against the next invoice.</w:t>
+      </w:r>
+    </w:p>
+    <w:p>
+      <w:pPr>
+        <w:spacing w:before="240" w:after="160"/>
+      </w:pPr>
+      <w:r>
+        <w:rPr>
+          <w:rFonts w:ascii="Calibri" w:hAnsi="Calibri" w:eastAsia="Calibri"/>
+          <w:b/>
+          <w:color w:val="0E7C46"/>
+          <w:sz w:val="26"/>
+        </w:rPr>
+        <w:t>A17.  Anti-bribery and sanctions</w:t>
+      </w:r>
+    </w:p>
+    <w:p>
+      <w:pPr>
+        <w:spacing w:after="160" w:before="0" w:line="269" w:lineRule="auto"/>
+        <w:jc w:val="both"/>
+      </w:pPr>
+      <w:r>
+        <w:rPr>
+          <w:rFonts w:ascii="Calibri" w:hAnsi="Calibri" w:eastAsia="Calibri"/>
+          <w:b w:val="0"/>
+          <w:color w:val="13202E"/>
+          <w:sz w:val="22"/>
+        </w:rPr>
+        <w:t>Each party shall comply with applicable anti-bribery and anti-corruption laws (including the Prevention and Combating of Corrupt Activities Act, 12 of 2004, and, where relevant, the UK Bribery Act 2010) and shall not offer or accept an improper payment or benefit in connection with this Agreement. Each party represents that it is not a sanctioned person and is not owned or controlled by one. A material breach of this clause is a material breach of this Agreement not capable of remedy.</w:t>
+      </w:r>
+    </w:p>
+    <w:p>
+      <w:pPr>
+        <w:spacing w:before="240" w:after="160"/>
+      </w:pPr>
+      <w:r>
+        <w:rPr>
+          <w:rFonts w:ascii="Calibri" w:hAnsi="Calibri" w:eastAsia="Calibri"/>
+          <w:b/>
+          <w:color w:val="0E7C46"/>
+          <w:sz w:val="26"/>
+        </w:rPr>
+        <w:t>A18.  Conflicts of interest</w:t>
+      </w:r>
+    </w:p>
+    <w:p>
+      <w:pPr>
+        <w:spacing w:after="160" w:before="0" w:line="269" w:lineRule="auto"/>
+        <w:jc w:val="both"/>
+      </w:pPr>
+      <w:r>
+        <w:rPr>
+          <w:rFonts w:ascii="Calibri" w:hAnsi="Calibri" w:eastAsia="Calibri"/>
+          <w:b w:val="0"/>
+          <w:color w:val="13202E"/>
+          <w:sz w:val="22"/>
+        </w:rPr>
+        <w:t>The Supplier shall disclose in writing any material conflict between this mandate and another client that would reasonably be expected to prejudice the Client's UK/US healthcare BPO campaign. The Supplier may serve other BPO and CX clients. Where a conflict cannot be managed by information barriers and the Client objects on reasonable grounds, the parties shall discuss in good faith whether that workstream should be paused or re-scoped.</w:t>
+      </w:r>
+    </w:p>
+    <w:p>
+      <w:pPr>
+        <w:spacing w:before="240" w:after="160"/>
+      </w:pPr>
+      <w:r>
+        <w:rPr>
+          <w:rFonts w:ascii="Calibri" w:hAnsi="Calibri" w:eastAsia="Calibri"/>
+          <w:b/>
+          <w:color w:val="0E7C46"/>
+          <w:sz w:val="26"/>
+        </w:rPr>
+        <w:t>A19.  Key personnel</w:t>
+      </w:r>
+    </w:p>
+    <w:p>
+      <w:pPr>
+        <w:spacing w:after="160" w:before="0" w:line="269" w:lineRule="auto"/>
+        <w:jc w:val="both"/>
+      </w:pPr>
+      <w:r>
+        <w:rPr>
+          <w:rFonts w:ascii="Calibri" w:hAnsi="Calibri" w:eastAsia="Calibri"/>
+          <w:b w:val="0"/>
+          <w:color w:val="13202E"/>
+          <w:sz w:val="22"/>
+        </w:rPr>
+        <w:t>The Supplier's lead for this Agreement is Kobus van der Westhuizen, who may delegate day-to-day delivery. The Supplier shall not permanently remove that lead from the engagement without reasonable notice and a suitable replacement, except for illness, resignation or cause. Precision Point resources are supplied through the Supplier and may change on notice, provided continuity of the plan in Addendum 1 is not unreasonably affected.</w:t>
+      </w:r>
+    </w:p>
+    <w:p>
+      <w:pPr>
+        <w:spacing w:before="240" w:after="160"/>
+      </w:pPr>
+      <w:r>
+        <w:rPr>
+          <w:rFonts w:ascii="Calibri" w:hAnsi="Calibri" w:eastAsia="Calibri"/>
+          <w:b/>
+          <w:color w:val="0E7C46"/>
+          <w:sz w:val="26"/>
+        </w:rPr>
+        <w:t>A20.  Return of property</w:t>
+      </w:r>
+    </w:p>
+    <w:p>
+      <w:pPr>
+        <w:spacing w:after="160" w:before="0" w:line="269" w:lineRule="auto"/>
+        <w:jc w:val="both"/>
+      </w:pPr>
+      <w:r>
+        <w:rPr>
+          <w:rFonts w:ascii="Calibri" w:hAnsi="Calibri" w:eastAsia="Calibri"/>
+          <w:b w:val="0"/>
+          <w:color w:val="13202E"/>
+          <w:sz w:val="22"/>
+        </w:rPr>
+        <w:t>On request, and in any event within 15 business days after the Term, each party shall return or securely destroy the other party's property, access credentials and Confidential Information (subject to A6.1). The Client remains licensed to use paid-for deliverables as in clause A22.</w:t>
+      </w:r>
+    </w:p>
+    <w:p>
+      <w:pPr>
+        <w:spacing w:before="240" w:after="160"/>
+      </w:pPr>
+      <w:r>
+        <w:rPr>
+          <w:rFonts w:ascii="Calibri" w:hAnsi="Calibri" w:eastAsia="Calibri"/>
+          <w:b/>
+          <w:color w:val="0E7C46"/>
+          <w:sz w:val="26"/>
+        </w:rPr>
+        <w:t>A21.  Liability</w:t>
+      </w:r>
+    </w:p>
+    <w:p>
+      <w:pPr>
+        <w:spacing w:after="160" w:before="0" w:line="269" w:lineRule="auto"/>
+        <w:jc w:val="both"/>
+      </w:pPr>
+      <w:r>
+        <w:rPr>
+          <w:rFonts w:ascii="Calibri" w:hAnsi="Calibri" w:eastAsia="Calibri"/>
+          <w:b w:val="0"/>
+          <w:color w:val="13202E"/>
+          <w:sz w:val="22"/>
+        </w:rPr>
+        <w:t>A21.1  The Supplier shall only be liable for its own actions or omissions and shall not be liable for: any act or omissions of any third party (other than its subcontractors in respect of the Services); unavailability of systems due to disruption of or any failure or fault in apparatus, lines and systems (including a failure in any third party's network); suspension of Services for routine or emergency maintenance or for non-payment; any event or circumstance which is out of the reasonable control of the Supplier (a force majeure event); any failure of non-Supplier equipment; any breach of security which occurs notwithstanding the Supplier's compliance with its security undertakings.</w:t>
+      </w:r>
+    </w:p>
+    <w:p>
+      <w:pPr>
+        <w:spacing w:after="160" w:before="0" w:line="269" w:lineRule="auto"/>
+        <w:jc w:val="both"/>
+      </w:pPr>
+      <w:r>
+        <w:rPr>
+          <w:rFonts w:ascii="Calibri" w:hAnsi="Calibri" w:eastAsia="Calibri"/>
+          <w:b w:val="0"/>
+          <w:color w:val="13202E"/>
+          <w:sz w:val="22"/>
+        </w:rPr>
+        <w:t>A21.2  The Supplier's liability, howsoever arising, is limited to the value of the professional fees that the Client has paid under the Addendum which is the subject of a claim in the immediate prior 12 months. Neither party is liable for indirect, incidental, or consequential damages, including loss of profit, revenue, goodwill or anticipated savings -- except that this exclusion does not apply to (a) unpaid Charges or commission, (b) a breach of confidentiality, non-solicitation or non-circumvention, or (c) the indemnities in clause A12, which remain subject to A21.3.</w:t>
+      </w:r>
+    </w:p>
+    <w:p>
+      <w:pPr>
+        <w:spacing w:after="160" w:before="0" w:line="269" w:lineRule="auto"/>
+        <w:jc w:val="both"/>
+      </w:pPr>
+      <w:r>
+        <w:rPr>
+          <w:rFonts w:ascii="Calibri" w:hAnsi="Calibri" w:eastAsia="Calibri"/>
+          <w:b w:val="0"/>
+          <w:color w:val="13202E"/>
+          <w:sz w:val="22"/>
+        </w:rPr>
+        <w:t>A21.3  Nothing in this Agreement excludes liability for fraud, death or personal injury caused by negligence, or any liability that cannot be excluded by South African law.</w:t>
+      </w:r>
+    </w:p>
+    <w:p>
+      <w:pPr>
+        <w:spacing w:before="240" w:after="160"/>
+      </w:pPr>
+      <w:r>
+        <w:rPr>
+          <w:rFonts w:ascii="Calibri" w:hAnsi="Calibri" w:eastAsia="Calibri"/>
+          <w:b/>
+          <w:color w:val="0E7C46"/>
+          <w:sz w:val="26"/>
+        </w:rPr>
+        <w:t>A22.  Intellectual property</w:t>
+      </w:r>
+    </w:p>
+    <w:p>
+      <w:pPr>
+        <w:spacing w:after="160" w:before="0" w:line="269" w:lineRule="auto"/>
+        <w:jc w:val="both"/>
+      </w:pPr>
+      <w:r>
+        <w:rPr>
+          <w:rFonts w:ascii="Calibri" w:hAnsi="Calibri" w:eastAsia="Calibri"/>
+          <w:b w:val="0"/>
+          <w:color w:val="13202E"/>
+          <w:sz w:val="22"/>
+        </w:rPr>
+        <w:t>Each party retains ownership of its intellectual property, with no transfer of rights unless expressly agreed in writing. The Client is granted a non-exclusive licence to use deliverables produced under an Addendum for its internal business purposes. The Supplier may reuse generic know-how, methodologies and templates. Marketing and sales collateral produced for the Client may be used by both parties for the purpose of the engagement. Client marks remain the Client's; the Supplier's marks remain the Supplier's.</w:t>
+      </w:r>
+    </w:p>
+    <w:p>
+      <w:pPr>
+        <w:spacing w:before="240" w:after="160"/>
+      </w:pPr>
+      <w:r>
+        <w:rPr>
+          <w:rFonts w:ascii="Calibri" w:hAnsi="Calibri" w:eastAsia="Calibri"/>
+          <w:b/>
+          <w:color w:val="0E7C46"/>
+          <w:sz w:val="26"/>
+        </w:rPr>
+        <w:t>A23.  Force majeure</w:t>
+      </w:r>
+    </w:p>
+    <w:p>
+      <w:pPr>
+        <w:spacing w:after="160" w:before="0" w:line="269" w:lineRule="auto"/>
+        <w:jc w:val="both"/>
+      </w:pPr>
+      <w:r>
+        <w:rPr>
+          <w:rFonts w:ascii="Calibri" w:hAnsi="Calibri" w:eastAsia="Calibri"/>
+          <w:b w:val="0"/>
+          <w:color w:val="13202E"/>
+          <w:sz w:val="22"/>
+        </w:rPr>
+        <w:t>The Supplier is not liable for delays or non-performance due to events beyond its control, such as natural disasters, epidemic, utility failure, or strikes. If such events last over three months, the Client may terminate the affected Addendum on 10 business days' written demand.</w:t>
+      </w:r>
+    </w:p>
+    <w:p>
+      <w:pPr>
+        <w:spacing w:before="240" w:after="160"/>
+      </w:pPr>
+      <w:r>
+        <w:rPr>
+          <w:rFonts w:ascii="Calibri" w:hAnsi="Calibri" w:eastAsia="Calibri"/>
+          <w:b/>
+          <w:color w:val="0E7C46"/>
+          <w:sz w:val="26"/>
+        </w:rPr>
+        <w:t>A24.  Dispute resolution</w:t>
+      </w:r>
+    </w:p>
+    <w:p>
+      <w:pPr>
+        <w:spacing w:after="160" w:before="0" w:line="269" w:lineRule="auto"/>
+        <w:jc w:val="both"/>
+      </w:pPr>
+      <w:r>
+        <w:rPr>
+          <w:rFonts w:ascii="Calibri" w:hAnsi="Calibri" w:eastAsia="Calibri"/>
+          <w:b w:val="0"/>
+          <w:color w:val="13202E"/>
+          <w:sz w:val="22"/>
+        </w:rPr>
+        <w:t>A24.1  In the event of a dispute arising from or in connection with this Agreement, the parties shall first attempt to resolve the matter through good faith negotiations.</w:t>
+      </w:r>
+    </w:p>
+    <w:p>
+      <w:pPr>
+        <w:spacing w:after="160" w:before="0" w:line="269" w:lineRule="auto"/>
+        <w:jc w:val="both"/>
+      </w:pPr>
+      <w:r>
+        <w:rPr>
+          <w:rFonts w:ascii="Calibri" w:hAnsi="Calibri" w:eastAsia="Calibri"/>
+          <w:b w:val="0"/>
+          <w:color w:val="13202E"/>
+          <w:sz w:val="22"/>
+        </w:rPr>
+        <w:t>A24.2  If unresolved within 10 business days, the dispute shall be referred to mediation, and if necessary, arbitration in Johannesburg in accordance with the rules of the Arbitration Foundation of Southern Africa (AFSA). This clause shall not preclude either party from seeking urgent interim relief, and the Supplier shall be entitled to approach any court of competent jurisdiction for any unpaid Charges.</w:t>
+      </w:r>
+    </w:p>
+    <w:p>
+      <w:pPr>
+        <w:spacing w:before="240" w:after="160"/>
+      </w:pPr>
+      <w:r>
+        <w:rPr>
+          <w:rFonts w:ascii="Calibri" w:hAnsi="Calibri" w:eastAsia="Calibri"/>
+          <w:b/>
+          <w:color w:val="0E7C46"/>
+          <w:sz w:val="26"/>
+        </w:rPr>
+        <w:t>A25.  General</w:t>
+      </w:r>
+    </w:p>
+    <w:p>
+      <w:pPr>
+        <w:spacing w:after="120" w:before="0" w:line="269" w:lineRule="auto"/>
+        <w:jc w:val="both"/>
+      </w:pPr>
+      <w:r>
+        <w:rPr>
+          <w:rFonts w:ascii="Calibri" w:hAnsi="Calibri" w:eastAsia="Calibri"/>
+          <w:b w:val="0"/>
+          <w:color w:val="13202E"/>
+          <w:sz w:val="22"/>
+        </w:rPr>
+        <w:t>A25.1  This Agreement will be governed under the laws of South Africa, and both parties submit to the exclusive jurisdiction of the South African courts (subject to clause A24).</w:t>
+      </w:r>
+    </w:p>
+    <w:p>
+      <w:pPr>
+        <w:spacing w:after="120" w:before="0" w:line="269" w:lineRule="auto"/>
+        <w:jc w:val="both"/>
+      </w:pPr>
+      <w:r>
+        <w:rPr>
+          <w:rFonts w:ascii="Calibri" w:hAnsi="Calibri" w:eastAsia="Calibri"/>
+          <w:b w:val="0"/>
+          <w:color w:val="13202E"/>
+          <w:sz w:val="22"/>
+        </w:rPr>
+        <w:t>A25.2  This Agreement is the whole agreement between the Client and the Supplier and excludes any express or implied or tacit term, representation, warranty, promise or the like not recorded herein, whether it induced the contract or not, save for any statutory requirements. Any variation to this Agreement must be in writing and signed between the parties.</w:t>
+      </w:r>
+    </w:p>
+    <w:p>
+      <w:pPr>
+        <w:spacing w:after="120" w:before="0" w:line="269" w:lineRule="auto"/>
+        <w:jc w:val="both"/>
+      </w:pPr>
+      <w:r>
+        <w:rPr>
+          <w:rFonts w:ascii="Calibri" w:hAnsi="Calibri" w:eastAsia="Calibri"/>
+          <w:b w:val="0"/>
+          <w:color w:val="13202E"/>
+          <w:sz w:val="22"/>
+        </w:rPr>
+        <w:t>A25.3  A failure or delay by a party to exercise any right or remedy hereunder or by law shall not constitute a waiver of that or any other right or remedy.</w:t>
+      </w:r>
+    </w:p>
+    <w:p>
+      <w:pPr>
+        <w:spacing w:after="120" w:before="0" w:line="269" w:lineRule="auto"/>
+        <w:jc w:val="both"/>
+      </w:pPr>
+      <w:r>
+        <w:rPr>
+          <w:rFonts w:ascii="Calibri" w:hAnsi="Calibri" w:eastAsia="Calibri"/>
+          <w:b w:val="0"/>
+          <w:color w:val="13202E"/>
+          <w:sz w:val="22"/>
+        </w:rPr>
+        <w:t>A25.4  All notices must be delivered by hand or email to the address on the cover pages, or any other address notified to the other party, which takes effect on the 5th day of written notification. Any notice given in writing and actually received by a party's authorised representatives will be deemed properly given, notwithstanding that it has not been given in accordance with this clause.</w:t>
+      </w:r>
+    </w:p>
+    <w:p>
+      <w:pPr>
+        <w:spacing w:after="120" w:before="0" w:line="269" w:lineRule="auto"/>
+        <w:jc w:val="both"/>
+      </w:pPr>
+      <w:r>
+        <w:rPr>
+          <w:rFonts w:ascii="Calibri" w:hAnsi="Calibri" w:eastAsia="Calibri"/>
+          <w:b w:val="0"/>
+          <w:color w:val="13202E"/>
+          <w:sz w:val="22"/>
+        </w:rPr>
+        <w:t>A25.5  When any number of days is prescribed, same shall be reckoned exclusively of the first and inclusively of the last day unless the last day falls on a Saturday, Sunday or South African public holiday, in which case the last day shall be the next succeeding business day.</w:t>
+      </w:r>
+    </w:p>
+    <w:p>
+      <w:pPr>
+        <w:spacing w:after="120" w:before="0" w:line="269" w:lineRule="auto"/>
+        <w:jc w:val="both"/>
+      </w:pPr>
+      <w:r>
+        <w:rPr>
+          <w:rFonts w:ascii="Calibri" w:hAnsi="Calibri" w:eastAsia="Calibri"/>
+          <w:b w:val="0"/>
+          <w:color w:val="13202E"/>
+          <w:sz w:val="22"/>
+        </w:rPr>
+        <w:t>A25.6  It is specifically recorded that whilst the parties may correspond via e-mail for operational reasons, no formal legal notice nor any amendment to the Agreement will be of any force and effect if communicated via e-mail, unless specifically for purposes of attaching a signed notice, save that (i) invoices and purchase-order references may be sent by e-mail, and (ii) prior agreement to pass-through costs may be given by e-mail.</w:t>
+      </w:r>
+    </w:p>
+    <w:p>
+      <w:pPr>
+        <w:spacing w:after="120" w:before="0" w:line="269" w:lineRule="auto"/>
+        <w:jc w:val="both"/>
+      </w:pPr>
+      <w:r>
+        <w:rPr>
+          <w:rFonts w:ascii="Calibri" w:hAnsi="Calibri" w:eastAsia="Calibri"/>
+          <w:b w:val="0"/>
+          <w:color w:val="13202E"/>
+          <w:sz w:val="22"/>
+        </w:rPr>
+        <w:t>A25.7  The provisions of the Agreement are severable and the invalidity of any one or more of such provisions will in no way affect the validity of the remaining provisions. The parties intend clauses A7 and A8 to be enforced to the maximum extent permitted.</w:t>
+      </w:r>
+    </w:p>
+    <w:p>
+      <w:pPr>
+        <w:spacing w:after="120" w:before="0" w:line="269" w:lineRule="auto"/>
+        <w:jc w:val="both"/>
+      </w:pPr>
+      <w:r>
+        <w:rPr>
+          <w:rFonts w:ascii="Calibri" w:hAnsi="Calibri" w:eastAsia="Calibri"/>
+          <w:b w:val="0"/>
+          <w:color w:val="13202E"/>
+          <w:sz w:val="22"/>
+        </w:rPr>
+        <w:t>A25.8  Neither party may assign or transfer (in whole or in part) any of its rights or obligations under the Agreement, without the other party's prior written consent (such consent not to be unreasonably withheld or delayed), except that the Supplier may assign to an affiliate in the Trilogy group on written notice.</w:t>
+      </w:r>
+    </w:p>
+    <w:p>
+      <w:pPr>
+        <w:spacing w:after="120" w:before="0" w:line="269" w:lineRule="auto"/>
+        <w:jc w:val="both"/>
+      </w:pPr>
+      <w:r>
+        <w:rPr>
+          <w:rFonts w:ascii="Calibri" w:hAnsi="Calibri" w:eastAsia="Calibri"/>
+          <w:b w:val="0"/>
+          <w:color w:val="13202E"/>
+          <w:sz w:val="22"/>
+        </w:rPr>
+        <w:t>A25.9  The Agreement may be executed in any number of counterparts, including electronic signature contemplated in the Electronic Communications and Transactions Act, 25 of 2002. No counterpart shall be effective until each party has executed at least one counterpart.</w:t>
+      </w:r>
+    </w:p>
+    <w:p>
+      <w:pPr>
+        <w:spacing w:after="120" w:before="0" w:line="269" w:lineRule="auto"/>
+        <w:jc w:val="both"/>
+      </w:pPr>
+      <w:r>
+        <w:rPr>
+          <w:rFonts w:ascii="Calibri" w:hAnsi="Calibri" w:eastAsia="Calibri"/>
+          <w:b w:val="0"/>
+          <w:color w:val="13202E"/>
+          <w:sz w:val="22"/>
+        </w:rPr>
+        <w:t>A25.10  The provisions of this Agreement shall be binding upon the successors-in-title and assigns of the parties.</w:t>
+      </w:r>
+    </w:p>
+    <w:p>
+      <w:pPr>
+        <w:spacing w:after="120" w:before="0" w:line="269" w:lineRule="auto"/>
+        <w:jc w:val="both"/>
+      </w:pPr>
+      <w:r>
+        <w:rPr>
+          <w:rFonts w:ascii="Calibri" w:hAnsi="Calibri" w:eastAsia="Calibri"/>
+          <w:b w:val="0"/>
+          <w:color w:val="13202E"/>
+          <w:sz w:val="22"/>
+        </w:rPr>
+        <w:t>A25.11  The rule of interpretation that a contract is to be interpreted against the party responsible for drafting shall not apply.</w:t>
+      </w:r>
+    </w:p>
+    <w:p>
+      <w:pPr>
+        <w:spacing w:after="120" w:before="0" w:line="269" w:lineRule="auto"/>
+        <w:jc w:val="both"/>
+      </w:pPr>
+      <w:r>
+        <w:rPr>
+          <w:rFonts w:ascii="Calibri" w:hAnsi="Calibri" w:eastAsia="Calibri"/>
+          <w:b w:val="0"/>
+          <w:color w:val="13202E"/>
+          <w:sz w:val="22"/>
+        </w:rPr>
+        <w:t>A25.12  "Calendar month" means a month beginning on the first day of any given month and ending on the last day of the same month. Where notice is given on any day of the month other than the first, the notice period will only commence on the first day of the following month.</w:t>
+      </w:r>
+    </w:p>
+    <w:p>
+      <w:pPr>
+        <w:spacing w:after="120" w:before="0" w:line="269" w:lineRule="auto"/>
+        <w:jc w:val="both"/>
+      </w:pPr>
+      <w:r>
+        <w:rPr>
+          <w:rFonts w:ascii="Calibri" w:hAnsi="Calibri" w:eastAsia="Calibri"/>
+          <w:b w:val="0"/>
+          <w:color w:val="13202E"/>
+          <w:sz w:val="22"/>
+        </w:rPr>
+        <w:t>A25.13  Each party shall, at its own cost, do all things reasonably required to give effect to this Agreement.</w:t>
       </w:r>
     </w:p>
     <w:p>
@@ -7226,7 +8067,7 @@
           <w:color w:val="13202E"/>
           <w:sz w:val="22"/>
         </w:rPr>
-        <w:t>The Client will pay a commission of 15% (fifteen percent) on all revenues billed by the Client directly to clients in respect of work originated or supported under this Addendum. This percentage will be validated and revised once the Supplier and Precision Point have completed the retail “Market Pricing” exercise in the first three months. Commission is due within 30 days of the Client invoicing the underlying client, and is payable in the same currency as that underlying invoice (or USD if the parties so agree). Survival: commission remains payable on such revenues billed after expiry of this Addendum where the introduction or opportunity arose during the Term, for 12 months after expiry, unless the parties agree otherwise in writing when revising the percentage.</w:t>
+        <w:t>The Client will pay a commission of 15% (fifteen percent) on all revenues billed by the Client directly to clients in respect of work originated or supported under this Addendum, including revenues billed to Introduced Clients as defined in Part A. This percentage will be validated and revised once the Supplier and Precision Point have completed the retail “Market Pricing” exercise in the first three months. Commission is due within 30 days of the Client invoicing the underlying client, and is payable in the same currency as that underlying invoice (or USD if the parties so agree). Survival: commission remains payable on such revenues billed after expiry of this Addendum where the introduction or opportunity arose during the Term, for 12 months after expiry (aligned with the Restricted Period), unless the parties agree otherwise in writing when revising the percentage. The Client shall notify the Supplier in writing within 10 business days of issuing an invoice to an Introduced Client, stating the client name, invoice date and amount (exclusive of VAT).</w:t>
       </w:r>
     </w:p>
     <w:p>
@@ -7240,7 +8081,36 @@
           <w:color w:val="0E7C46"/>
           <w:sz w:val="26"/>
         </w:rPr>
-        <w:t>1.8  Pass-through costs</w:t>
+        <w:t>1.8  Target list</w:t>
+      </w:r>
+    </w:p>
+    <w:p>
+      <w:pPr>
+        <w:spacing w:after="160" w:before="0" w:line="269" w:lineRule="auto"/>
+        <w:jc w:val="both"/>
+      </w:pPr>
+      <w:r>
+        <w:rPr>
+          <w:rFonts w:ascii="Calibri" w:hAnsi="Calibri" w:eastAsia="Calibri"/>
+          <w:b w:val="0"/>
+          <w:color w:val="13202E"/>
+          <w:sz w:val="22"/>
+        </w:rPr>
+        <w:t>By the end of Week 6 the parties shall maintain a written target list of companies and executives (updated as names are added). A name on that list is an Introduced Client for Part A. Removing a name requires both parties’ written agreement. The list is Confidential Information.</w:t>
+      </w:r>
+    </w:p>
+    <w:p>
+      <w:pPr>
+        <w:spacing w:before="240" w:after="160"/>
+      </w:pPr>
+      <w:r>
+        <w:rPr>
+          <w:rFonts w:ascii="Calibri" w:hAnsi="Calibri" w:eastAsia="Calibri"/>
+          <w:b/>
+          <w:color w:val="0E7C46"/>
+          <w:sz w:val="26"/>
+        </w:rPr>
+        <w:t>1.9  Pass-through costs</w:t>
       </w:r>
     </w:p>
     <w:p>
@@ -7269,7 +8139,7 @@
           <w:color w:val="0E7C46"/>
           <w:sz w:val="26"/>
         </w:rPr>
-        <w:t>1.9  Client dependencies</w:t>
+        <w:t>1.10  Client dependencies</w:t>
       </w:r>
     </w:p>
     <w:p>
@@ -7373,7 +8243,7 @@
           <w:color w:val="0E7C46"/>
           <w:sz w:val="26"/>
         </w:rPr>
-        <w:t>1.10  Acknowledgement of this Addendum</w:t>
+        <w:t>1.11  Acknowledgement of this Addendum</w:t>
       </w:r>
     </w:p>
     <w:p>

</xml_diff>